<commit_message>
updated to use FeatureClassToFeatureClass instead of QuickImport
</commit_message>
<xml_diff>
--- a/doc/data_prep_documentation.docx
+++ b/doc/data_prep_documentation.docx
@@ -240,11 +240,13 @@
         <w:spacing w:line="240" w:lineRule="auto"/>
         <w:rPr>
           <w:b w:val="1"/>
+          <w:bCs w:val="1"/>
         </w:rPr>
       </w:pPr>
       <w:r>
         <w:rPr>
           <w:b w:val="1"/>
+          <w:bCs w:val="1"/>
           <w:rtl w:val="0"/>
         </w:rPr>
         <w:t xml:space="preserve">Purpose and description:</w:t>
@@ -315,11 +317,13 @@
         <w:spacing w:line="240" w:lineRule="auto"/>
         <w:rPr>
           <w:b w:val="1"/>
+          <w:bCs w:val="1"/>
         </w:rPr>
       </w:pPr>
       <w:r>
         <w:rPr>
           <w:b w:val="1"/>
+          <w:bCs w:val="1"/>
           <w:rtl w:val="0"/>
         </w:rPr>
         <w:t xml:space="preserve">Data Required:</w:t>
@@ -330,6 +334,7 @@
         <w:spacing w:line="240" w:lineRule="auto"/>
         <w:rPr>
           <w:b w:val="1"/>
+          <w:bCs w:val="1"/>
         </w:rPr>
       </w:pPr>
       <w:r>
@@ -631,6 +636,7 @@
       <w:r>
         <w:rPr>
           <w:b w:val="1"/>
+          <w:bCs w:val="1"/>
           <w:rtl w:val="0"/>
         </w:rPr>
         <w:t xml:space="preserve">Outputs:</w:t>
@@ -686,6 +692,7 @@
       <w:r>
         <w:rPr>
           <w:b w:val="1"/>
+          <w:bCs w:val="1"/>
           <w:rtl w:val="0"/>
         </w:rPr>
         <w:t xml:space="preserve">Inputs:</w:t>
@@ -1121,6 +1128,49 @@
     </w:p>
     <w:p>
       <w:pPr>
+        <w:ind w:left="0" w:firstLine="0"/>
+        <w:rPr/>
+      </w:pPr>
+      <w:r>
+        <w:rPr>
+          <w:rtl w:val="0"/>
+        </w:rPr>
+      </w:r>
+    </w:p>
+    <w:p>
+      <w:pPr>
+        <w:rPr/>
+      </w:pPr>
+      <w:r>
+        <w:rPr>
+          <w:rtl w:val="0"/>
+        </w:rPr>
+        <w:t xml:space="preserve">The output roads have a oneway and reversed field added to allow for oneway functionality based on the OSM ‘oneway’ tag. The ‘oneway’ tag for OSM roads is represented by 0 for not oneway, 1 for oneway, and -1 for oneway and reversed direction. If a road does not have the ‘oneway’ tag, it will receive a 0 for the oneway and reversed fields. </w:t>
+      </w:r>
+    </w:p>
+    <w:p>
+      <w:pPr>
+        <w:rPr/>
+      </w:pPr>
+      <w:r>
+        <w:rPr>
+          <w:rtl w:val="0"/>
+        </w:rPr>
+      </w:r>
+    </w:p>
+    <w:p>
+      <w:pPr>
+        <w:rPr/>
+      </w:pPr>
+      <w:r>
+        <w:rPr>
+          <w:rtl w:val="0"/>
+        </w:rPr>
+        <w:t xml:space="preserve">Roads also get a speed limit field based on the ‘maxspeed’ tag. If a road does not have this tag, a default speed limit is used. Each state has its own default speed limits for each road type in the list above. The default speed limits were found by calculating the most common speed limit for each road type in each state. If the state did not have any speed limit data for a given road type, the most common speed limit for that road type across the US is used.</w:t>
+      </w:r>
+    </w:p>
+    <w:p>
+      <w:pPr>
         <w:rPr/>
       </w:pPr>
       <w:r>
@@ -1458,20 +1508,48 @@
     </w:p>
     <w:p>
       <w:pPr>
+        <w:ind w:left="0" w:firstLine="0"/>
+        <w:rPr/>
+      </w:pPr>
+      <w:r>
+        <w:rPr>
+          <w:rtl w:val="0"/>
+        </w:rPr>
+      </w:r>
+    </w:p>
+    <w:p>
+      <w:pPr>
         <w:pStyle w:val="Heading2"/>
         <w:spacing w:after="240" w:before="240" w:lineRule="auto"/>
         <w:rPr/>
       </w:pPr>
-      <w:bookmarkStart w:colFirst="0" w:colLast="0" w:name="_9wia57tbrdgb" w:id="7"/>
+      <w:bookmarkStart w:colFirst="0" w:colLast="0" w:name="_mdr814a3u3yv" w:id="6"/>
+      <w:bookmarkEnd w:id="6"/>
+      <w:r>
+        <w:br w:type="page"/>
+      </w:r>
+      <w:r>
+        <w:rPr>
+          <w:rtl w:val="0"/>
+        </w:rPr>
+      </w:r>
+    </w:p>
+    <w:p>
+      <w:pPr>
+        <w:pStyle w:val="Heading2"/>
+        <w:spacing w:after="240" w:before="240" w:lineRule="auto"/>
+        <w:rPr/>
+      </w:pPr>
+      <w:bookmarkStart w:colFirst="0" w:colLast="0" w:name="_9wia57tbrdgb" w:id="8"/>
+      <w:bookmarkEnd w:id="8"/>
+      <w:r>
+        <w:rPr>
+          <w:rtl w:val="0"/>
+        </w:rPr>
+        <w:t xml:space="preserve">3</w:t>
+      </w:r>
+      <w:bookmarkStart w:colFirst="0" w:colLast="0" w:name="kix.6zwnprhvf41h" w:id="7"/>
       <w:bookmarkEnd w:id="7"/>
-      <w:r>
-        <w:rPr>
-          <w:rtl w:val="0"/>
-        </w:rPr>
-        <w:t xml:space="preserve">3</w:t>
-      </w:r>
-      <w:bookmarkStart w:colFirst="0" w:colLast="0" w:name="kix.6zwnprhvf41h" w:id="6"/>
-      <w:bookmarkEnd w:id="6"/>
       <w:r>
         <w:rPr>
           <w:rtl w:val="0"/>
@@ -1554,23 +1632,7 @@
         <w:rPr>
           <w:rtl w:val="0"/>
         </w:rPr>
-        <w:t xml:space="preserve">Use Data Interoperability’s </w:t>
-      </w:r>
-      <w:hyperlink r:id="rId8">
-        <w:r>
-          <w:rPr>
-            <w:color w:val="1155cc"/>
-            <w:u w:val="single"/>
-            <w:rtl w:val="0"/>
-          </w:rPr>
-          <w:t xml:space="preserve">Quick Import</w:t>
-        </w:r>
-      </w:hyperlink>
-      <w:r>
-        <w:rPr>
-          <w:rtl w:val="0"/>
-        </w:rPr>
-        <w:t xml:space="preserve"> tool to import the road feature class (from </w:t>
+        <w:t xml:space="preserve">Create a new FileGDB and use FeatureClassToFeatureClass to import the road feature class (from </w:t>
       </w:r>
       <w:hyperlink w:anchor="kix.oaw6lxo2qlas">
         <w:r>
@@ -1586,7 +1648,7 @@
         <w:rPr>
           <w:rtl w:val="0"/>
         </w:rPr>
-        <w:t xml:space="preserve">). This tool creates a File GDB with the new road feature class inside.</w:t>
+        <w:t xml:space="preserve">). </w:t>
       </w:r>
     </w:p>
     <w:p>
@@ -1752,6 +1814,24 @@
     <w:p>
       <w:pPr>
         <w:numPr>
+          <w:ilvl w:val="2"/>
+          <w:numId w:val="13"/>
+        </w:numPr>
+        <w:ind w:left="2160" w:hanging="360"/>
+        <w:rPr>
+          <w:u w:val="none"/>
+        </w:rPr>
+      </w:pPr>
+      <w:r>
+        <w:rPr>
+          <w:rtl w:val="0"/>
+        </w:rPr>
+        <w:t xml:space="preserve">If the physiographic region boundary file contains multiple polygons (to represent subregions), harvest sites will be separated based on these polygons. One harvest site feature class will exist for each polygon, with the ID of the polygon concatenated to the end of the shape file name. If the polygon does not contain any harvest sites, no feature class will be made for that polygon.</w:t>
+      </w:r>
+    </w:p>
+    <w:p>
+      <w:pPr>
+        <w:numPr>
           <w:ilvl w:val="1"/>
           <w:numId w:val="13"/>
         </w:numPr>
@@ -1764,7 +1844,43 @@
         <w:rPr>
           <w:rtl w:val="0"/>
         </w:rPr>
-        <w:t xml:space="preserve">Filter for year completed to be between 2019 and 2024 (may change depending on when this script is run</w:t>
+        <w:t xml:space="preserve">Filter for harvests that have been completed in the latest five years of the data</w:t>
+      </w:r>
+    </w:p>
+    <w:p>
+      <w:pPr>
+        <w:numPr>
+          <w:ilvl w:val="2"/>
+          <w:numId w:val="13"/>
+        </w:numPr>
+        <w:ind w:left="2160" w:hanging="360"/>
+        <w:rPr>
+          <w:u w:val="none"/>
+        </w:rPr>
+      </w:pPr>
+      <w:r>
+        <w:rPr>
+          <w:rtl w:val="0"/>
+        </w:rPr>
+        <w:t xml:space="preserve">The latest five years are defined as the latest completed harvest’s date - 5 years, NOT the current date - 5 years.</w:t>
+      </w:r>
+    </w:p>
+    <w:p>
+      <w:pPr>
+        <w:numPr>
+          <w:ilvl w:val="2"/>
+          <w:numId w:val="13"/>
+        </w:numPr>
+        <w:ind w:left="2160" w:hanging="360"/>
+        <w:rPr>
+          <w:u w:val="none"/>
+        </w:rPr>
+      </w:pPr>
+      <w:r>
+        <w:rPr>
+          <w:rtl w:val="0"/>
+        </w:rPr>
+        <w:t xml:space="preserve">Also, in the harvest site data, some future dates for completion have been included. These will not be included.</w:t>
       </w:r>
     </w:p>
     <w:p>
@@ -2130,6 +2246,24 @@
     <w:p>
       <w:pPr>
         <w:numPr>
+          <w:ilvl w:val="2"/>
+          <w:numId w:val="13"/>
+        </w:numPr>
+        <w:ind w:left="2160" w:hanging="360"/>
+        <w:rPr>
+          <w:u w:val="none"/>
+        </w:rPr>
+      </w:pPr>
+      <w:r>
+        <w:rPr>
+          <w:rtl w:val="0"/>
+        </w:rPr>
+        <w:t xml:space="preserve">Add a travel time field in hours. Calculated by the distance divided by the speed limit.</w:t>
+      </w:r>
+    </w:p>
+    <w:p>
+      <w:pPr>
+        <w:numPr>
           <w:ilvl w:val="0"/>
           <w:numId w:val="13"/>
         </w:numPr>
@@ -2217,7 +2351,64 @@
         <w:rPr>
           <w:rtl w:val="0"/>
         </w:rPr>
-        <w:t xml:space="preserve">Must have access to Data Interoperability tools.</w:t>
+        <w:t xml:space="preserve">This script creates an instance of a DataPrep class and calls the process() method. However, the user can create their own script that creates a DataPrep object. This allows for custom inputs that lets the user start at any point in the overall process. The process() method contains boolean parameters for each of the steps listed above. Alternatively, each method can be called individually. However, each method uses variables that are modified throughout the entire process. When the user desires to start the process from the middle, the previous methods must be run beforehand and a new DataPrep with new inputs must be created. It has not been tested that the DataPrep class can function like this so proceed with caution. </w:t>
+      </w:r>
+    </w:p>
+    <w:p>
+      <w:pPr>
+        <w:numPr>
+          <w:ilvl w:val="1"/>
+          <w:numId w:val="9"/>
+        </w:numPr>
+        <w:ind w:left="1440" w:hanging="360"/>
+        <w:rPr>
+          <w:u w:val="none"/>
+        </w:rPr>
+      </w:pPr>
+      <w:r>
+        <w:rPr>
+          <w:rtl w:val="0"/>
+        </w:rPr>
+        <w:t xml:space="preserve">Steps one and two need to be run for other steps to function</w:t>
+      </w:r>
+    </w:p>
+    <w:p>
+      <w:pPr>
+        <w:numPr>
+          <w:ilvl w:val="1"/>
+          <w:numId w:val="9"/>
+        </w:numPr>
+        <w:ind w:left="1440" w:hanging="360"/>
+        <w:rPr>
+          <w:u w:val="none"/>
+        </w:rPr>
+      </w:pPr>
+      <w:r>
+        <w:rPr>
+          <w:rtl w:val="0"/>
+        </w:rPr>
+        <w:t xml:space="preserve">For all other steps to be run separately, it is recommended to create a DataPrep object with parameters updated to previously created files</w:t>
+      </w:r>
+    </w:p>
+    <w:p>
+      <w:pPr>
+        <w:numPr>
+          <w:ilvl w:val="1"/>
+          <w:numId w:val="9"/>
+        </w:numPr>
+        <w:ind w:left="1440" w:hanging="360"/>
+        <w:rPr>
+          <w:b w:val="1"/>
+          <w:bCs w:val="1"/>
+        </w:rPr>
+      </w:pPr>
+      <w:r>
+        <w:rPr>
+          <w:b w:val="1"/>
+          <w:bCs w:val="1"/>
+          <w:rtl w:val="0"/>
+        </w:rPr>
+        <w:t xml:space="preserve">Recommendation: run this script as is without skipping any steps</w:t>
       </w:r>
     </w:p>
     <w:p>
@@ -2235,79 +2426,6 @@
         <w:rPr>
           <w:rtl w:val="0"/>
         </w:rPr>
-        <w:t xml:space="preserve">This script creates an instance of a DataPrep class and calls the process() method. However, the user can create their own script that creates a DataPrep object. This allows for custom inputs that lets the user start at any point in the overall process. The process() method contains boolean parameters for each of the steps listed above. Alternatively, each method can be called individually. However, each method uses variables that are modified throughout the entire process. When the user desires to start the process from the middle, the previous methods must be run beforehand and a new DataPrep with new inputs must be created. It has not been tested that the DataPrep class can function like this so proceed with caution. </w:t>
-      </w:r>
-    </w:p>
-    <w:p>
-      <w:pPr>
-        <w:numPr>
-          <w:ilvl w:val="1"/>
-          <w:numId w:val="9"/>
-        </w:numPr>
-        <w:ind w:left="1440" w:hanging="360"/>
-        <w:rPr>
-          <w:u w:val="none"/>
-        </w:rPr>
-      </w:pPr>
-      <w:r>
-        <w:rPr>
-          <w:rtl w:val="0"/>
-        </w:rPr>
-        <w:t xml:space="preserve">Steps one and two need to be run for other steps to function</w:t>
-      </w:r>
-    </w:p>
-    <w:p>
-      <w:pPr>
-        <w:numPr>
-          <w:ilvl w:val="1"/>
-          <w:numId w:val="9"/>
-        </w:numPr>
-        <w:ind w:left="1440" w:hanging="360"/>
-        <w:rPr>
-          <w:u w:val="none"/>
-        </w:rPr>
-      </w:pPr>
-      <w:r>
-        <w:rPr>
-          <w:rtl w:val="0"/>
-        </w:rPr>
-        <w:t xml:space="preserve">For all other steps to be run separately, it is recommended to create a DataPrep object with parameters updated to previously created files</w:t>
-      </w:r>
-    </w:p>
-    <w:p>
-      <w:pPr>
-        <w:numPr>
-          <w:ilvl w:val="1"/>
-          <w:numId w:val="9"/>
-        </w:numPr>
-        <w:ind w:left="1440" w:hanging="360"/>
-        <w:rPr>
-          <w:b w:val="1"/>
-        </w:rPr>
-      </w:pPr>
-      <w:r>
-        <w:rPr>
-          <w:b w:val="1"/>
-          <w:rtl w:val="0"/>
-        </w:rPr>
-        <w:t xml:space="preserve">Recommendation: run this script as is without skipping any steps</w:t>
-      </w:r>
-    </w:p>
-    <w:p>
-      <w:pPr>
-        <w:numPr>
-          <w:ilvl w:val="0"/>
-          <w:numId w:val="9"/>
-        </w:numPr>
-        <w:ind w:left="720" w:hanging="360"/>
-        <w:rPr>
-          <w:u w:val="none"/>
-        </w:rPr>
-      </w:pPr>
-      <w:r>
-        <w:rPr>
-          <w:rtl w:val="0"/>
-        </w:rPr>
         <w:t xml:space="preserve">The merge process is not perfect. Although most of the network dataset will be functional, there will be some connectivity issues (not enough to affect validity of </w:t>
       </w:r>
       <w:r>
@@ -2322,6 +2440,28 @@
         </w:rPr>
         <w:t xml:space="preserve"> analysis). </w:t>
         <w:br w:type="textWrapping"/>
+      </w:r>
+    </w:p>
+    <w:p>
+      <w:pPr>
+        <w:ind w:left="0" w:firstLine="0"/>
+        <w:rPr/>
+      </w:pPr>
+      <w:r>
+        <w:rPr>
+          <w:rtl w:val="0"/>
+        </w:rPr>
+      </w:r>
+    </w:p>
+    <w:p>
+      <w:pPr>
+        <w:ind w:left="0" w:firstLine="0"/>
+        <w:rPr/>
+      </w:pPr>
+      <w:r>
+        <w:rPr>
+          <w:rtl w:val="0"/>
+        </w:rPr>
       </w:r>
     </w:p>
     <w:p>
@@ -2989,21 +3129,21 @@
         <w:spacing w:after="240" w:before="240" w:lineRule="auto"/>
         <w:rPr/>
       </w:pPr>
-      <w:bookmarkStart w:colFirst="0" w:colLast="0" w:name="_tuldfay0casz" w:id="9"/>
+      <w:bookmarkStart w:colFirst="0" w:colLast="0" w:name="_tuldfay0casz" w:id="10"/>
+      <w:bookmarkEnd w:id="10"/>
+      <w:r>
+        <w:rPr>
+          <w:rtl w:val="0"/>
+        </w:rPr>
+        <w:t xml:space="preserve">4</w:t>
+      </w:r>
+      <w:bookmarkStart w:colFirst="0" w:colLast="0" w:name="kix.vqydb79uoubm" w:id="9"/>
       <w:bookmarkEnd w:id="9"/>
       <w:r>
         <w:rPr>
           <w:rtl w:val="0"/>
         </w:rPr>
-        <w:t xml:space="preserve">4</w:t>
-      </w:r>
-      <w:bookmarkStart w:colFirst="0" w:colLast="0" w:name="kix.vqydb79uoubm" w:id="8"/>
-      <w:bookmarkEnd w:id="8"/>
-      <w:r>
-        <w:rPr>
-          <w:rtl w:val="0"/>
-        </w:rPr>
-        <w:t xml:space="preserve">. One way functionality</w:t>
+        <w:t xml:space="preserve">. One-way functionality and Time Cost</w:t>
       </w:r>
     </w:p>
     <w:p>
@@ -3035,7 +3175,17 @@
         <w:rPr>
           <w:rtl w:val="0"/>
         </w:rPr>
-        <w:t xml:space="preserve">1. Oneway functionality must be manually implemented in ArcGIS Pro. To do so, follow these steps:</w:t>
+        <w:t xml:space="preserve">1. Two travel modes must be created for both distance and time cost to be available. To do so:</w:t>
+      </w:r>
+    </w:p>
+    <w:p>
+      <w:pPr>
+        <w:rPr/>
+      </w:pPr>
+      <w:r>
+        <w:rPr>
+          <w:rtl w:val="0"/>
+        </w:rPr>
       </w:r>
     </w:p>
     <w:p>
@@ -3045,9 +3195,6 @@
           <w:numId w:val="1"/>
         </w:numPr>
         <w:ind w:left="720" w:hanging="360"/>
-        <w:rPr>
-          <w:u w:val="none"/>
-        </w:rPr>
       </w:pPr>
       <w:r>
         <w:rPr>
@@ -3087,12 +3234,44 @@
         <w:rPr>
           <w:rtl w:val="0"/>
         </w:rPr>
-        <w:t xml:space="preserve">Create a new travel mode called "Driving Distance" by clicking the 3 lines on the top right corner of the properties window and selecting the ‘New’ option.</w:t>
-      </w:r>
-    </w:p>
-    <w:p>
-      <w:pPr>
-        <w:ind w:left="0" w:firstLine="0"/>
+        <w:t xml:space="preserve">Create two travel modes, one called "Length", one called "Time"</w:t>
+      </w:r>
+    </w:p>
+    <w:p>
+      <w:pPr>
+        <w:numPr>
+          <w:ilvl w:val="1"/>
+          <w:numId w:val="1"/>
+        </w:numPr>
+        <w:ind w:left="1440" w:hanging="360"/>
+      </w:pPr>
+      <w:r>
+        <w:rPr>
+          <w:rtl w:val="0"/>
+        </w:rPr>
+        <w:t xml:space="preserve">Travel modes can be created by clicking the 3 lines on the top right corner of the properties window and selecting the ‘New’ option.</w:t>
+      </w:r>
+    </w:p>
+    <w:p>
+      <w:pPr>
+        <w:numPr>
+          <w:ilvl w:val="0"/>
+          <w:numId w:val="1"/>
+        </w:numPr>
+        <w:ind w:left="720" w:hanging="360"/>
+        <w:rPr>
+          <w:u w:val="none"/>
+        </w:rPr>
+      </w:pPr>
+      <w:r>
+        <w:rPr>
+          <w:rtl w:val="0"/>
+        </w:rPr>
+        <w:t xml:space="preserve">Ensure “Type” is set to Driving</w:t>
+      </w:r>
+    </w:p>
+    <w:p>
+      <w:pPr>
         <w:rPr/>
       </w:pPr>
       <w:r>
@@ -3122,7 +3301,7 @@
                           <pic:cNvPicPr preferRelativeResize="0"/>
                         </pic:nvPicPr>
                         <pic:blipFill>
-                          <a:blip r:embed="rId9">
+                          <a:blip r:embed="rId8">
                             <a:alphaModFix/>
                           </a:blip>
                           <a:stretch>
@@ -3230,16 +3409,16 @@
               <wp:inline distB="114300" distT="114300" distL="114300" distR="114300">
                 <wp:extent cx="5943600" cy="1384300"/>
                 <wp:effectExtent b="0" l="0" r="0" t="0"/>
-                <wp:docPr id="2" name="image4.png"/>
+                <wp:docPr id="2" name="image3.png"/>
                 <a:graphic>
                   <a:graphicData uri="http://schemas.openxmlformats.org/drawingml/2006/picture">
                     <pic:pic>
                       <pic:nvPicPr>
-                        <pic:cNvPr id="0" name="image4.png"/>
+                        <pic:cNvPr id="0" name="image3.png"/>
                         <pic:cNvPicPr preferRelativeResize="0"/>
                       </pic:nvPicPr>
                       <pic:blipFill>
-                        <a:blip r:embed="rId10"/>
+                        <a:blip r:embed="rId9"/>
                         <a:srcRect/>
                         <a:stretch>
                           <a:fillRect/>
@@ -3270,8 +3449,26 @@
     <w:p>
       <w:pPr>
         <w:numPr>
+          <w:ilvl w:val="0"/>
+          <w:numId w:val="14"/>
+        </w:numPr>
+        <w:ind w:left="720" w:hanging="360"/>
+        <w:rPr>
+          <w:u w:val="none"/>
+        </w:rPr>
+      </w:pPr>
+      <w:r>
+        <w:rPr>
+          <w:rtl w:val="0"/>
+        </w:rPr>
+        <w:t xml:space="preserve">Go to the Costs tab</w:t>
+      </w:r>
+    </w:p>
+    <w:p>
+      <w:pPr>
+        <w:numPr>
           <w:ilvl w:val="1"/>
-          <w:numId w:val="1"/>
+          <w:numId w:val="14"/>
         </w:numPr>
         <w:ind w:left="1440" w:hanging="360"/>
         <w:rPr>
@@ -3282,25 +3479,79 @@
         <w:rPr>
           <w:rtl w:val="0"/>
         </w:rPr>
-        <w:t xml:space="preserve">Under costs, ensure length is used for impedance</w:t>
-      </w:r>
-    </w:p>
-    <w:p>
-      <w:pPr>
-        <w:numPr>
-          <w:ilvl w:val="0"/>
-          <w:numId w:val="1"/>
-        </w:numPr>
-        <w:ind w:left="720" w:hanging="360"/>
-        <w:rPr>
-          <w:u w:val="none"/>
-        </w:rPr>
-      </w:pPr>
-      <w:r>
-        <w:rPr>
-          <w:rtl w:val="0"/>
-        </w:rPr>
-        <w:t xml:space="preserve">Under the ‘Costs’ tab at the top, ensure the ‘distance’ field is used for the evaluators and units are set to ‘Miles’</w:t>
+        <w:t xml:space="preserve">For the default "Length" cost</w:t>
+      </w:r>
+    </w:p>
+    <w:p>
+      <w:pPr>
+        <w:numPr>
+          <w:ilvl w:val="1"/>
+          <w:numId w:val="14"/>
+        </w:numPr>
+        <w:ind w:left="1440" w:hanging="360"/>
+        <w:rPr>
+          <w:u w:val="none"/>
+        </w:rPr>
+      </w:pPr>
+      <w:r>
+        <w:rPr>
+          <w:rtl w:val="0"/>
+        </w:rPr>
+        <w:t xml:space="preserve">Set the units to Miles</w:t>
+      </w:r>
+    </w:p>
+    <w:p>
+      <w:pPr>
+        <w:numPr>
+          <w:ilvl w:val="1"/>
+          <w:numId w:val="14"/>
+        </w:numPr>
+        <w:ind w:left="1440" w:hanging="360"/>
+        <w:rPr>
+          <w:u w:val="none"/>
+        </w:rPr>
+      </w:pPr>
+      <w:r>
+        <w:rPr>
+          <w:rtl w:val="0"/>
+        </w:rPr>
+        <w:t xml:space="preserve">For evaluators: </w:t>
+      </w:r>
+    </w:p>
+    <w:p>
+      <w:pPr>
+        <w:numPr>
+          <w:ilvl w:val="2"/>
+          <w:numId w:val="14"/>
+        </w:numPr>
+        <w:ind w:left="2160" w:hanging="360"/>
+        <w:rPr>
+          <w:u w:val="none"/>
+        </w:rPr>
+      </w:pPr>
+      <w:r>
+        <w:rPr>
+          <w:rtl w:val="0"/>
+        </w:rPr>
+        <w:t xml:space="preserve">Set the type as “Field Script” for both Along and Against</w:t>
+      </w:r>
+    </w:p>
+    <w:p>
+      <w:pPr>
+        <w:numPr>
+          <w:ilvl w:val="2"/>
+          <w:numId w:val="14"/>
+        </w:numPr>
+        <w:ind w:left="2160" w:hanging="360"/>
+        <w:rPr>
+          <w:u w:val="none"/>
+        </w:rPr>
+      </w:pPr>
+      <w:r>
+        <w:rPr>
+          <w:rtl w:val="0"/>
+        </w:rPr>
+        <w:t xml:space="preserve">Set the value to the !distance! field for both Along and Against</w:t>
       </w:r>
     </w:p>
     <w:p>
@@ -3314,7 +3565,7 @@
           <mc:Choice Requires="wpg">
             <w:drawing>
               <wp:inline distB="114300" distT="114300" distL="114300" distR="114300">
-                <wp:extent cx="4845440" cy="4367213"/>
+                <wp:extent cx="4310063" cy="3509882"/>
                 <wp:effectExtent b="0" l="0" r="0" t="0"/>
                 <wp:docPr id="3" name=""/>
                 <a:graphic>
@@ -3323,10 +3574,10 @@
                       <wpg:cNvGrpSpPr/>
                       <wpg:grpSpPr>
                         <a:xfrm>
-                          <a:off x="152400" y="152400"/>
-                          <a:ext cx="4845440" cy="4367213"/>
-                          <a:chOff x="152400" y="152400"/>
-                          <a:chExt cx="7258050" cy="6543675"/>
+                          <a:off x="152400" y="2922825"/>
+                          <a:ext cx="4310063" cy="3509882"/>
+                          <a:chOff x="152400" y="2922825"/>
+                          <a:chExt cx="4597075" cy="3773250"/>
                         </a:xfrm>
                       </wpg:grpSpPr>
                       <pic:pic>
@@ -3334,18 +3585,17 @@
                           <pic:cNvPr id="8" name="Shape 8"/>
                           <pic:cNvPicPr preferRelativeResize="0"/>
                         </pic:nvPicPr>
-                        <pic:blipFill>
-                          <a:blip r:embed="rId11">
+                        <pic:blipFill rotWithShape="1">
+                          <a:blip r:embed="rId10">
                             <a:alphaModFix/>
                           </a:blip>
-                          <a:stretch>
-                            <a:fillRect/>
-                          </a:stretch>
+                          <a:srcRect b="0" l="0" r="36661" t="42337"/>
+                          <a:stretch/>
                         </pic:blipFill>
                         <pic:spPr>
                           <a:xfrm>
-                            <a:off x="152400" y="152400"/>
-                            <a:ext cx="7258050" cy="6543675"/>
+                            <a:off x="152400" y="2922825"/>
+                            <a:ext cx="4597051" cy="3773250"/>
                           </a:xfrm>
                           <a:prstGeom prst="rect">
                             <a:avLst/>
@@ -3441,18 +3691,18 @@
           <mc:Fallback>
             <w:drawing>
               <wp:inline distB="114300" distT="114300" distL="114300" distR="114300">
-                <wp:extent cx="4845440" cy="4367213"/>
+                <wp:extent cx="4310063" cy="3509882"/>
                 <wp:effectExtent b="0" l="0" r="0" t="0"/>
-                <wp:docPr id="3" name="image5.png"/>
+                <wp:docPr id="3" name="image4.png"/>
                 <a:graphic>
                   <a:graphicData uri="http://schemas.openxmlformats.org/drawingml/2006/picture">
                     <pic:pic>
                       <pic:nvPicPr>
-                        <pic:cNvPr id="0" name="image5.png"/>
+                        <pic:cNvPr id="0" name="image4.png"/>
                         <pic:cNvPicPr preferRelativeResize="0"/>
                       </pic:nvPicPr>
                       <pic:blipFill>
-                        <a:blip r:embed="rId10"/>
+                        <a:blip r:embed="rId9"/>
                         <a:srcRect/>
                         <a:stretch>
                           <a:fillRect/>
@@ -3461,7 +3711,7 @@
                       <pic:spPr>
                         <a:xfrm>
                           <a:off x="0" y="0"/>
-                          <a:ext cx="4845440" cy="4367213"/>
+                          <a:ext cx="4310063" cy="3509882"/>
                         </a:xfrm>
                         <a:prstGeom prst="rect"/>
                         <a:ln/>
@@ -3474,6 +3724,712 @@
           </mc:Fallback>
         </mc:AlternateContent>
       </w:r>
+      <w:r>
+        <w:rPr>
+          <w:rtl w:val="0"/>
+        </w:rPr>
+      </w:r>
+    </w:p>
+    <w:p>
+      <w:pPr>
+        <w:numPr>
+          <w:ilvl w:val="0"/>
+          <w:numId w:val="14"/>
+        </w:numPr>
+        <w:ind w:left="720" w:hanging="360"/>
+        <w:rPr>
+          <w:u w:val="none"/>
+        </w:rPr>
+      </w:pPr>
+      <w:r>
+        <w:rPr>
+          <w:rtl w:val="0"/>
+        </w:rPr>
+        <w:t xml:space="preserve">Create a new cost by clicking the 3 lines in the top right and selecting “New</w:t>
+      </w:r>
+    </w:p>
+    <w:p>
+      <w:pPr>
+        <w:numPr>
+          <w:ilvl w:val="1"/>
+          <w:numId w:val="14"/>
+        </w:numPr>
+        <w:ind w:left="1440" w:hanging="360"/>
+        <w:rPr>
+          <w:u w:val="none"/>
+        </w:rPr>
+      </w:pPr>
+      <w:r>
+        <w:rPr>
+          <w:rtl w:val="0"/>
+        </w:rPr>
+        <w:t xml:space="preserve">Name the cost “Time”</w:t>
+      </w:r>
+    </w:p>
+    <w:p>
+      <w:pPr>
+        <w:numPr>
+          <w:ilvl w:val="1"/>
+          <w:numId w:val="14"/>
+        </w:numPr>
+        <w:ind w:left="1440" w:hanging="360"/>
+        <w:rPr>
+          <w:u w:val="none"/>
+        </w:rPr>
+      </w:pPr>
+      <w:r>
+        <w:rPr>
+          <w:rtl w:val="0"/>
+        </w:rPr>
+        <w:t xml:space="preserve">Set the units to hours</w:t>
+      </w:r>
+    </w:p>
+    <w:p>
+      <w:pPr>
+        <w:numPr>
+          <w:ilvl w:val="1"/>
+          <w:numId w:val="14"/>
+        </w:numPr>
+        <w:ind w:left="1440" w:hanging="360"/>
+        <w:rPr>
+          <w:u w:val="none"/>
+        </w:rPr>
+      </w:pPr>
+      <w:r>
+        <w:rPr>
+          <w:rtl w:val="0"/>
+        </w:rPr>
+        <w:t xml:space="preserve">For evaluators:</w:t>
+      </w:r>
+    </w:p>
+    <w:p>
+      <w:pPr>
+        <w:numPr>
+          <w:ilvl w:val="2"/>
+          <w:numId w:val="14"/>
+        </w:numPr>
+        <w:ind w:left="2160" w:hanging="360"/>
+        <w:rPr>
+          <w:u w:val="none"/>
+        </w:rPr>
+      </w:pPr>
+      <w:r>
+        <w:rPr>
+          <w:rtl w:val="0"/>
+        </w:rPr>
+        <w:t xml:space="preserve">set the type as "Field Script" for both Along and Against</w:t>
+      </w:r>
+    </w:p>
+    <w:p>
+      <w:pPr>
+        <w:numPr>
+          <w:ilvl w:val="2"/>
+          <w:numId w:val="14"/>
+        </w:numPr>
+        <w:ind w:left="2160" w:hanging="360"/>
+        <w:rPr>
+          <w:u w:val="none"/>
+        </w:rPr>
+      </w:pPr>
+      <w:r>
+        <w:rPr>
+          <w:rtl w:val="0"/>
+        </w:rPr>
+        <w:t xml:space="preserve">for both Along and Against, set the value to the !travel_time! field</w:t>
+      </w:r>
+    </w:p>
+    <w:p>
+      <w:pPr>
+        <w:rPr/>
+      </w:pPr>
+      <w:r>
+        <w:rPr/>
+        <mc:AlternateContent>
+          <mc:Choice Requires="wpg">
+            <w:drawing>
+              <wp:inline distB="114300" distT="114300" distL="114300" distR="114300">
+                <wp:extent cx="4478895" cy="3630262"/>
+                <wp:effectExtent b="0" l="0" r="0" t="0"/>
+                <wp:docPr id="4" name=""/>
+                <a:graphic>
+                  <a:graphicData uri="http://schemas.microsoft.com/office/word/2010/wordprocessingGroup">
+                    <wpg:wgp>
+                      <wpg:cNvGrpSpPr/>
+                      <wpg:grpSpPr>
+                        <a:xfrm>
+                          <a:off x="152400" y="152400"/>
+                          <a:ext cx="4478895" cy="3630262"/>
+                          <a:chOff x="152400" y="152400"/>
+                          <a:chExt cx="3295650" cy="2676525"/>
+                        </a:xfrm>
+                      </wpg:grpSpPr>
+                      <pic:pic>
+                        <pic:nvPicPr>
+                          <pic:cNvPr id="11" name="Shape 11"/>
+                          <pic:cNvPicPr preferRelativeResize="0"/>
+                        </pic:nvPicPr>
+                        <pic:blipFill>
+                          <a:blip r:embed="rId11">
+                            <a:alphaModFix/>
+                          </a:blip>
+                          <a:stretch>
+                            <a:fillRect/>
+                          </a:stretch>
+                        </pic:blipFill>
+                        <pic:spPr>
+                          <a:xfrm>
+                            <a:off x="152400" y="152400"/>
+                            <a:ext cx="3295650" cy="2676525"/>
+                          </a:xfrm>
+                          <a:prstGeom prst="rect">
+                            <a:avLst/>
+                          </a:prstGeom>
+                          <a:noFill/>
+                          <a:ln>
+                            <a:noFill/>
+                          </a:ln>
+                        </pic:spPr>
+                      </pic:pic>
+                      <wps:wsp>
+                        <wps:cNvSpPr/>
+                        <wps:cNvPr id="12" name="Shape 12"/>
+                        <wps:spPr>
+                          <a:xfrm>
+                            <a:off x="1849900" y="1798300"/>
+                            <a:ext cx="1592100" cy="338400"/>
+                          </a:xfrm>
+                          <a:prstGeom prst="rect">
+                            <a:avLst/>
+                          </a:prstGeom>
+                          <a:noFill/>
+                          <a:ln cap="flat" cmpd="sng" w="9525">
+                            <a:solidFill>
+                              <a:srgbClr val="FF0000"/>
+                            </a:solidFill>
+                            <a:prstDash val="solid"/>
+                            <a:round/>
+                            <a:headEnd len="sm" w="sm" type="none"/>
+                            <a:tailEnd len="sm" w="sm" type="none"/>
+                          </a:ln>
+                        </wps:spPr>
+                        <wps:txbx>
+                          <w:txbxContent>
+                            <w:p>
+                              <w:pPr>
+                                <w:spacing w:after="0" w:before="0" w:line="240"/>
+                                <w:ind w:left="0" w:right="0" w:firstLine="0"/>
+                                <w:jc w:val="center"/>
+                                <w:textDirection w:val="btLr"/>
+                              </w:pPr>
+                            </w:p>
+                          </w:txbxContent>
+                        </wps:txbx>
+                        <wps:bodyPr anchorCtr="0" anchor="ctr" bIns="91425" lIns="91425" spcFirstLastPara="1" rIns="91425" wrap="square" tIns="91425">
+                          <a:noAutofit/>
+                        </wps:bodyPr>
+                      </wps:wsp>
+                      <wps:wsp>
+                        <wps:cNvSpPr/>
+                        <wps:cNvPr id="13" name="Shape 13"/>
+                        <wps:spPr>
+                          <a:xfrm>
+                            <a:off x="168175" y="285725"/>
+                            <a:ext cx="2925600" cy="567300"/>
+                          </a:xfrm>
+                          <a:prstGeom prst="rect">
+                            <a:avLst/>
+                          </a:prstGeom>
+                          <a:noFill/>
+                          <a:ln cap="flat" cmpd="sng" w="9525">
+                            <a:solidFill>
+                              <a:srgbClr val="FF0000"/>
+                            </a:solidFill>
+                            <a:prstDash val="solid"/>
+                            <a:round/>
+                            <a:headEnd len="sm" w="sm" type="none"/>
+                            <a:tailEnd len="sm" w="sm" type="none"/>
+                          </a:ln>
+                        </wps:spPr>
+                        <wps:txbx>
+                          <w:txbxContent>
+                            <w:p>
+                              <w:pPr>
+                                <w:spacing w:after="0" w:before="0" w:line="240"/>
+                                <w:ind w:left="0" w:right="0" w:firstLine="0"/>
+                                <w:jc w:val="center"/>
+                                <w:textDirection w:val="btLr"/>
+                              </w:pPr>
+                            </w:p>
+                          </w:txbxContent>
+                        </wps:txbx>
+                        <wps:bodyPr anchorCtr="0" anchor="ctr" bIns="91425" lIns="91425" spcFirstLastPara="1" rIns="91425" wrap="square" tIns="91425">
+                          <a:noAutofit/>
+                        </wps:bodyPr>
+                      </wps:wsp>
+                    </wpg:wgp>
+                  </a:graphicData>
+                </a:graphic>
+              </wp:inline>
+            </w:drawing>
+          </mc:Choice>
+          <mc:Fallback>
+            <w:drawing>
+              <wp:inline distB="114300" distT="114300" distL="114300" distR="114300">
+                <wp:extent cx="4478895" cy="3630262"/>
+                <wp:effectExtent b="0" l="0" r="0" t="0"/>
+                <wp:docPr id="4" name="image5.png"/>
+                <a:graphic>
+                  <a:graphicData uri="http://schemas.openxmlformats.org/drawingml/2006/picture">
+                    <pic:pic>
+                      <pic:nvPicPr>
+                        <pic:cNvPr id="0" name="image5.png"/>
+                        <pic:cNvPicPr preferRelativeResize="0"/>
+                      </pic:nvPicPr>
+                      <pic:blipFill>
+                        <a:blip r:embed="rId9"/>
+                        <a:srcRect/>
+                        <a:stretch>
+                          <a:fillRect/>
+                        </a:stretch>
+                      </pic:blipFill>
+                      <pic:spPr>
+                        <a:xfrm>
+                          <a:off x="0" y="0"/>
+                          <a:ext cx="4478895" cy="3630262"/>
+                        </a:xfrm>
+                        <a:prstGeom prst="rect"/>
+                        <a:ln/>
+                      </pic:spPr>
+                    </pic:pic>
+                  </a:graphicData>
+                </a:graphic>
+              </wp:inline>
+            </w:drawing>
+          </mc:Fallback>
+        </mc:AlternateContent>
+      </w:r>
+      <w:r>
+        <w:rPr>
+          <w:rtl w:val="0"/>
+        </w:rPr>
+      </w:r>
+    </w:p>
+    <w:p>
+      <w:pPr>
+        <w:numPr>
+          <w:ilvl w:val="0"/>
+          <w:numId w:val="14"/>
+        </w:numPr>
+        <w:ind w:left="720" w:hanging="360"/>
+        <w:rPr>
+          <w:u w:val="none"/>
+        </w:rPr>
+      </w:pPr>
+      <w:r>
+        <w:rPr>
+          <w:rtl w:val="0"/>
+        </w:rPr>
+        <w:t xml:space="preserve">Go back to the Travel Modes tab</w:t>
+      </w:r>
+    </w:p>
+    <w:p>
+      <w:pPr>
+        <w:numPr>
+          <w:ilvl w:val="1"/>
+          <w:numId w:val="14"/>
+        </w:numPr>
+        <w:ind w:left="1440" w:hanging="360"/>
+        <w:rPr>
+          <w:u w:val="none"/>
+        </w:rPr>
+      </w:pPr>
+      <w:r>
+        <w:rPr>
+          <w:rtl w:val="0"/>
+        </w:rPr>
+        <w:t xml:space="preserve">For the Impedance selection, select the proper cost for the respective travel mode</w:t>
+      </w:r>
+    </w:p>
+    <w:p>
+      <w:pPr>
+        <w:ind w:left="0" w:firstLine="0"/>
+        <w:rPr/>
+      </w:pPr>
+      <w:r>
+        <w:rPr/>
+        <mc:AlternateContent>
+          <mc:Choice Requires="wpg">
+            <w:drawing>
+              <wp:inline distB="114300" distT="114300" distL="114300" distR="114300">
+                <wp:extent cx="3910013" cy="2795048"/>
+                <wp:effectExtent b="0" l="0" r="0" t="0"/>
+                <wp:docPr id="6" name=""/>
+                <a:graphic>
+                  <a:graphicData uri="http://schemas.microsoft.com/office/word/2010/wordprocessingGroup">
+                    <wpg:wgp>
+                      <wpg:cNvGrpSpPr/>
+                      <wpg:grpSpPr>
+                        <a:xfrm>
+                          <a:off x="152400" y="152400"/>
+                          <a:ext cx="3910013" cy="2795048"/>
+                          <a:chOff x="152400" y="152400"/>
+                          <a:chExt cx="4857750" cy="3467100"/>
+                        </a:xfrm>
+                      </wpg:grpSpPr>
+                      <pic:pic>
+                        <pic:nvPicPr>
+                          <pic:cNvPr id="17" name="Shape 17"/>
+                          <pic:cNvPicPr preferRelativeResize="0"/>
+                        </pic:nvPicPr>
+                        <pic:blipFill>
+                          <a:blip r:embed="rId12">
+                            <a:alphaModFix/>
+                          </a:blip>
+                          <a:stretch>
+                            <a:fillRect/>
+                          </a:stretch>
+                        </pic:blipFill>
+                        <pic:spPr>
+                          <a:xfrm>
+                            <a:off x="152400" y="152400"/>
+                            <a:ext cx="4857750" cy="3467100"/>
+                          </a:xfrm>
+                          <a:prstGeom prst="rect">
+                            <a:avLst/>
+                          </a:prstGeom>
+                          <a:noFill/>
+                          <a:ln>
+                            <a:noFill/>
+                          </a:ln>
+                        </pic:spPr>
+                      </pic:pic>
+                      <wps:wsp>
+                        <wps:cNvSpPr/>
+                        <wps:cNvPr id="18" name="Shape 18"/>
+                        <wps:spPr>
+                          <a:xfrm>
+                            <a:off x="276625" y="542600"/>
+                            <a:ext cx="3034800" cy="456300"/>
+                          </a:xfrm>
+                          <a:prstGeom prst="rect">
+                            <a:avLst/>
+                          </a:prstGeom>
+                          <a:noFill/>
+                          <a:ln cap="flat" cmpd="sng" w="9525">
+                            <a:solidFill>
+                              <a:srgbClr val="FF0000"/>
+                            </a:solidFill>
+                            <a:prstDash val="solid"/>
+                            <a:round/>
+                            <a:headEnd len="sm" w="sm" type="none"/>
+                            <a:tailEnd len="sm" w="sm" type="none"/>
+                          </a:ln>
+                        </wps:spPr>
+                        <wps:txbx>
+                          <w:txbxContent>
+                            <w:p>
+                              <w:pPr>
+                                <w:spacing w:after="0" w:before="0" w:line="240"/>
+                                <w:ind w:left="0" w:right="0" w:firstLine="0"/>
+                                <w:jc w:val="center"/>
+                                <w:textDirection w:val="btLr"/>
+                              </w:pPr>
+                            </w:p>
+                          </w:txbxContent>
+                        </wps:txbx>
+                        <wps:bodyPr anchorCtr="0" anchor="ctr" bIns="91425" lIns="91425" spcFirstLastPara="1" rIns="91425" wrap="square" tIns="91425">
+                          <a:noAutofit/>
+                        </wps:bodyPr>
+                      </wps:wsp>
+                      <wps:wsp>
+                        <wps:cNvSpPr/>
+                        <wps:cNvPr id="19" name="Shape 19"/>
+                        <wps:spPr>
+                          <a:xfrm>
+                            <a:off x="484900" y="2288100"/>
+                            <a:ext cx="3917400" cy="505800"/>
+                          </a:xfrm>
+                          <a:prstGeom prst="rect">
+                            <a:avLst/>
+                          </a:prstGeom>
+                          <a:noFill/>
+                          <a:ln cap="flat" cmpd="sng" w="9525">
+                            <a:solidFill>
+                              <a:srgbClr val="FF0000"/>
+                            </a:solidFill>
+                            <a:prstDash val="solid"/>
+                            <a:round/>
+                            <a:headEnd len="sm" w="sm" type="none"/>
+                            <a:tailEnd len="sm" w="sm" type="none"/>
+                          </a:ln>
+                        </wps:spPr>
+                        <wps:txbx>
+                          <w:txbxContent>
+                            <w:p>
+                              <w:pPr>
+                                <w:spacing w:after="0" w:before="0" w:line="240"/>
+                                <w:ind w:left="0" w:right="0" w:firstLine="0"/>
+                                <w:jc w:val="center"/>
+                                <w:textDirection w:val="btLr"/>
+                              </w:pPr>
+                            </w:p>
+                          </w:txbxContent>
+                        </wps:txbx>
+                        <wps:bodyPr anchorCtr="0" anchor="ctr" bIns="91425" lIns="91425" spcFirstLastPara="1" rIns="91425" wrap="square" tIns="91425">
+                          <a:noAutofit/>
+                        </wps:bodyPr>
+                      </wps:wsp>
+                    </wpg:wgp>
+                  </a:graphicData>
+                </a:graphic>
+              </wp:inline>
+            </w:drawing>
+          </mc:Choice>
+          <mc:Fallback>
+            <w:drawing>
+              <wp:inline distB="114300" distT="114300" distL="114300" distR="114300">
+                <wp:extent cx="3910013" cy="2795048"/>
+                <wp:effectExtent b="0" l="0" r="0" t="0"/>
+                <wp:docPr id="6" name="image7.png"/>
+                <a:graphic>
+                  <a:graphicData uri="http://schemas.openxmlformats.org/drawingml/2006/picture">
+                    <pic:pic>
+                      <pic:nvPicPr>
+                        <pic:cNvPr id="0" name="image7.png"/>
+                        <pic:cNvPicPr preferRelativeResize="0"/>
+                      </pic:nvPicPr>
+                      <pic:blipFill>
+                        <a:blip r:embed="rId9"/>
+                        <a:srcRect/>
+                        <a:stretch>
+                          <a:fillRect/>
+                        </a:stretch>
+                      </pic:blipFill>
+                      <pic:spPr>
+                        <a:xfrm>
+                          <a:off x="0" y="0"/>
+                          <a:ext cx="3910013" cy="2795048"/>
+                        </a:xfrm>
+                        <a:prstGeom prst="rect"/>
+                        <a:ln/>
+                      </pic:spPr>
+                    </pic:pic>
+                  </a:graphicData>
+                </a:graphic>
+              </wp:inline>
+            </w:drawing>
+          </mc:Fallback>
+        </mc:AlternateContent>
+      </w:r>
+      <w:r>
+        <w:rPr>
+          <w:rtl w:val="0"/>
+        </w:rPr>
+      </w:r>
+    </w:p>
+    <w:p>
+      <w:pPr>
+        <w:rPr/>
+      </w:pPr>
+      <w:r>
+        <w:rPr/>
+        <mc:AlternateContent>
+          <mc:Choice Requires="wpg">
+            <w:drawing>
+              <wp:inline distB="114300" distT="114300" distL="114300" distR="114300">
+                <wp:extent cx="3986213" cy="2968635"/>
+                <wp:effectExtent b="0" l="0" r="0" t="0"/>
+                <wp:docPr id="5" name=""/>
+                <a:graphic>
+                  <a:graphicData uri="http://schemas.microsoft.com/office/word/2010/wordprocessingGroup">
+                    <wpg:wgp>
+                      <wpg:cNvGrpSpPr/>
+                      <wpg:grpSpPr>
+                        <a:xfrm>
+                          <a:off x="152400" y="152400"/>
+                          <a:ext cx="3986213" cy="2968635"/>
+                          <a:chOff x="152400" y="152400"/>
+                          <a:chExt cx="4495800" cy="3343275"/>
+                        </a:xfrm>
+                      </wpg:grpSpPr>
+                      <pic:pic>
+                        <pic:nvPicPr>
+                          <pic:cNvPr id="14" name="Shape 14"/>
+                          <pic:cNvPicPr preferRelativeResize="0"/>
+                        </pic:nvPicPr>
+                        <pic:blipFill>
+                          <a:blip r:embed="rId13">
+                            <a:alphaModFix/>
+                          </a:blip>
+                          <a:stretch>
+                            <a:fillRect/>
+                          </a:stretch>
+                        </pic:blipFill>
+                        <pic:spPr>
+                          <a:xfrm>
+                            <a:off x="152400" y="152400"/>
+                            <a:ext cx="4495800" cy="3343275"/>
+                          </a:xfrm>
+                          <a:prstGeom prst="rect">
+                            <a:avLst/>
+                          </a:prstGeom>
+                          <a:noFill/>
+                          <a:ln>
+                            <a:noFill/>
+                          </a:ln>
+                        </pic:spPr>
+                      </pic:pic>
+                      <wps:wsp>
+                        <wps:cNvSpPr/>
+                        <wps:cNvPr id="15" name="Shape 15"/>
+                        <wps:spPr>
+                          <a:xfrm>
+                            <a:off x="236950" y="473175"/>
+                            <a:ext cx="3124200" cy="476100"/>
+                          </a:xfrm>
+                          <a:prstGeom prst="rect">
+                            <a:avLst/>
+                          </a:prstGeom>
+                          <a:noFill/>
+                          <a:ln cap="flat" cmpd="sng" w="9525">
+                            <a:solidFill>
+                              <a:srgbClr val="FF0000"/>
+                            </a:solidFill>
+                            <a:prstDash val="solid"/>
+                            <a:round/>
+                            <a:headEnd len="sm" w="sm" type="none"/>
+                            <a:tailEnd len="sm" w="sm" type="none"/>
+                          </a:ln>
+                        </wps:spPr>
+                        <wps:txbx>
+                          <w:txbxContent>
+                            <w:p>
+                              <w:pPr>
+                                <w:spacing w:after="0" w:before="0" w:line="240"/>
+                                <w:ind w:left="0" w:right="0" w:firstLine="0"/>
+                                <w:jc w:val="center"/>
+                                <w:textDirection w:val="btLr"/>
+                              </w:pPr>
+                            </w:p>
+                          </w:txbxContent>
+                        </wps:txbx>
+                        <wps:bodyPr anchorCtr="0" anchor="ctr" bIns="91425" lIns="91425" spcFirstLastPara="1" rIns="91425" wrap="square" tIns="91425">
+                          <a:noAutofit/>
+                        </wps:bodyPr>
+                      </wps:wsp>
+                      <wps:wsp>
+                        <wps:cNvSpPr/>
+                        <wps:cNvPr id="16" name="Shape 16"/>
+                        <wps:spPr>
+                          <a:xfrm>
+                            <a:off x="445225" y="2258350"/>
+                            <a:ext cx="3887700" cy="456300"/>
+                          </a:xfrm>
+                          <a:prstGeom prst="rect">
+                            <a:avLst/>
+                          </a:prstGeom>
+                          <a:noFill/>
+                          <a:ln cap="flat" cmpd="sng" w="9525">
+                            <a:solidFill>
+                              <a:srgbClr val="FF0000"/>
+                            </a:solidFill>
+                            <a:prstDash val="solid"/>
+                            <a:round/>
+                            <a:headEnd len="sm" w="sm" type="none"/>
+                            <a:tailEnd len="sm" w="sm" type="none"/>
+                          </a:ln>
+                        </wps:spPr>
+                        <wps:txbx>
+                          <w:txbxContent>
+                            <w:p>
+                              <w:pPr>
+                                <w:spacing w:after="0" w:before="0" w:line="240"/>
+                                <w:ind w:left="0" w:right="0" w:firstLine="0"/>
+                                <w:jc w:val="center"/>
+                                <w:textDirection w:val="btLr"/>
+                              </w:pPr>
+                            </w:p>
+                          </w:txbxContent>
+                        </wps:txbx>
+                        <wps:bodyPr anchorCtr="0" anchor="ctr" bIns="91425" lIns="91425" spcFirstLastPara="1" rIns="91425" wrap="square" tIns="91425">
+                          <a:noAutofit/>
+                        </wps:bodyPr>
+                      </wps:wsp>
+                    </wpg:wgp>
+                  </a:graphicData>
+                </a:graphic>
+              </wp:inline>
+            </w:drawing>
+          </mc:Choice>
+          <mc:Fallback>
+            <w:drawing>
+              <wp:inline distB="114300" distT="114300" distL="114300" distR="114300">
+                <wp:extent cx="3986213" cy="2968635"/>
+                <wp:effectExtent b="0" l="0" r="0" t="0"/>
+                <wp:docPr id="5" name="image6.png"/>
+                <a:graphic>
+                  <a:graphicData uri="http://schemas.openxmlformats.org/drawingml/2006/picture">
+                    <pic:pic>
+                      <pic:nvPicPr>
+                        <pic:cNvPr id="0" name="image6.png"/>
+                        <pic:cNvPicPr preferRelativeResize="0"/>
+                      </pic:nvPicPr>
+                      <pic:blipFill>
+                        <a:blip r:embed="rId9"/>
+                        <a:srcRect/>
+                        <a:stretch>
+                          <a:fillRect/>
+                        </a:stretch>
+                      </pic:blipFill>
+                      <pic:spPr>
+                        <a:xfrm>
+                          <a:off x="0" y="0"/>
+                          <a:ext cx="3986213" cy="2968635"/>
+                        </a:xfrm>
+                        <a:prstGeom prst="rect"/>
+                        <a:ln/>
+                      </pic:spPr>
+                    </pic:pic>
+                  </a:graphicData>
+                </a:graphic>
+              </wp:inline>
+            </w:drawing>
+          </mc:Fallback>
+        </mc:AlternateContent>
+      </w:r>
+      <w:r>
+        <w:rPr>
+          <w:rtl w:val="0"/>
+        </w:rPr>
+      </w:r>
+    </w:p>
+    <w:p>
+      <w:pPr>
+        <w:rPr/>
+      </w:pPr>
+      <w:r>
+        <w:rPr>
+          <w:rtl w:val="0"/>
+        </w:rPr>
+      </w:r>
+    </w:p>
+    <w:p>
+      <w:pPr>
+        <w:ind w:left="0" w:firstLine="0"/>
+        <w:rPr/>
+      </w:pPr>
+      <w:r>
+        <w:rPr>
+          <w:rtl w:val="0"/>
+        </w:rPr>
+        <w:t xml:space="preserve">2. Oneway functionality must be manually implemented in ArcGIS Pro. To do so, follow these steps:</w:t>
+      </w:r>
+    </w:p>
+    <w:p>
+      <w:pPr>
+        <w:ind w:left="0" w:firstLine="0"/>
+        <w:rPr/>
+      </w:pPr>
       <w:r>
         <w:rPr>
           <w:rtl w:val="0"/>
@@ -3643,7 +4599,7 @@
                           <pic:cNvPicPr preferRelativeResize="0"/>
                         </pic:nvPicPr>
                         <pic:blipFill>
-                          <a:blip r:embed="rId12">
+                          <a:blip r:embed="rId14">
                             <a:alphaModFix/>
                           </a:blip>
                           <a:stretch>
@@ -3760,7 +4716,7 @@
                         <pic:cNvPicPr preferRelativeResize="0"/>
                       </pic:nvPicPr>
                       <pic:blipFill>
-                        <a:blip r:embed="rId10"/>
+                        <a:blip r:embed="rId9"/>
                         <a:srcRect/>
                         <a:stretch>
                           <a:fillRect/>
@@ -3881,6 +4837,20 @@
     </w:p>
     <w:p>
       <w:pPr>
+        <w:ind w:left="720" w:firstLine="0"/>
+        <w:rPr/>
+      </w:pPr>
+      <w:r>
+        <w:br w:type="page"/>
+      </w:r>
+      <w:r>
+        <w:rPr>
+          <w:rtl w:val="0"/>
+        </w:rPr>
+      </w:r>
+    </w:p>
+    <w:p>
+      <w:pPr>
         <w:numPr>
           <w:ilvl w:val="0"/>
           <w:numId w:val="1"/>
@@ -3899,7 +4869,9 @@
     </w:p>
     <w:p>
       <w:pPr>
-        <w:rPr/>
+        <w:rPr>
+          <w:rFonts w:ascii="Courier New" w:cs="Courier New" w:eastAsia="Courier New" w:hAnsi="Courier New"/>
+        </w:rPr>
       </w:pPr>
       <w:r>
         <w:rPr>
@@ -3911,7 +4883,7 @@
               <wp:inline distB="114300" distT="114300" distL="114300" distR="114300">
                 <wp:extent cx="5110163" cy="3644267"/>
                 <wp:effectExtent b="0" l="0" r="0" t="0"/>
-                <wp:docPr id="4" name=""/>
+                <wp:docPr id="7" name=""/>
                 <a:graphic>
                   <a:graphicData uri="http://schemas.microsoft.com/office/word/2010/wordprocessingGroup">
                     <wpg:wgp>
@@ -3926,11 +4898,11 @@
                       </wpg:grpSpPr>
                       <pic:pic>
                         <pic:nvPicPr>
-                          <pic:cNvPr id="11" name="Shape 11"/>
+                          <pic:cNvPr id="20" name="Shape 20"/>
                           <pic:cNvPicPr preferRelativeResize="0"/>
                         </pic:nvPicPr>
                         <pic:blipFill>
-                          <a:blip r:embed="rId13">
+                          <a:blip r:embed="rId15">
                             <a:alphaModFix/>
                           </a:blip>
                           <a:stretch>
@@ -3953,7 +4925,7 @@
                       </pic:pic>
                       <wps:wsp>
                         <wps:cNvSpPr/>
-                        <wps:cNvPr id="12" name="Shape 12"/>
+                        <wps:cNvPr id="21" name="Shape 21"/>
                         <wps:spPr>
                           <a:xfrm>
                             <a:off x="267475" y="3209800"/>
@@ -3991,7 +4963,7 @@
                       </wps:wsp>
                       <wps:wsp>
                         <wps:cNvSpPr/>
-                        <wps:cNvPr id="13" name="Shape 13"/>
+                        <wps:cNvPr id="22" name="Shape 22"/>
                         <wps:spPr>
                           <a:xfrm>
                             <a:off x="2599375" y="4630275"/>
@@ -4038,16 +5010,16 @@
               <wp:inline distB="114300" distT="114300" distL="114300" distR="114300">
                 <wp:extent cx="5110163" cy="3644267"/>
                 <wp:effectExtent b="0" l="0" r="0" t="0"/>
-                <wp:docPr id="4" name="image6.png"/>
+                <wp:docPr id="7" name="image8.png"/>
                 <a:graphic>
                   <a:graphicData uri="http://schemas.openxmlformats.org/drawingml/2006/picture">
                     <pic:pic>
                       <pic:nvPicPr>
-                        <pic:cNvPr id="0" name="image6.png"/>
+                        <pic:cNvPr id="0" name="image8.png"/>
                         <pic:cNvPicPr preferRelativeResize="0"/>
                       </pic:nvPicPr>
                       <pic:blipFill>
-                        <a:blip r:embed="rId10"/>
+                        <a:blip r:embed="rId9"/>
                         <a:srcRect/>
                         <a:stretch>
                           <a:fillRect/>
@@ -4077,6 +5049,18 @@
     </w:p>
     <w:p>
       <w:pPr>
+        <w:rPr>
+          <w:rFonts w:ascii="Courier New" w:cs="Courier New" w:eastAsia="Courier New" w:hAnsi="Courier New"/>
+        </w:rPr>
+      </w:pPr>
+      <w:r>
+        <w:rPr>
+          <w:rtl w:val="0"/>
+        </w:rPr>
+      </w:r>
+    </w:p>
+    <w:p>
+      <w:pPr>
         <w:numPr>
           <w:ilvl w:val="0"/>
           <w:numId w:val="1"/>
@@ -4104,7 +5088,7 @@
           <wp:inline distB="114300" distT="114300" distL="114300" distR="114300">
             <wp:extent cx="5943600" cy="876300"/>
             <wp:effectExtent b="0" l="0" r="0" t="0"/>
-            <wp:docPr id="5" name="image1.png"/>
+            <wp:docPr id="8" name="image1.png"/>
             <a:graphic>
               <a:graphicData uri="http://schemas.openxmlformats.org/drawingml/2006/picture">
                 <pic:pic>
@@ -4113,7 +5097,7 @@
                     <pic:cNvPicPr preferRelativeResize="0"/>
                   </pic:nvPicPr>
                   <pic:blipFill>
-                    <a:blip r:embed="rId14"/>
+                    <a:blip r:embed="rId16"/>
                     <a:srcRect b="0" l="0" r="0" t="0"/>
                     <a:stretch>
                       <a:fillRect/>
@@ -4141,13 +5125,24 @@
     </w:p>
     <w:p>
       <w:pPr>
-        <w:rPr/>
-      </w:pPr>
-      <w:r>
-        <w:rPr>
-          <w:rtl w:val="0"/>
-        </w:rPr>
-        <w:t xml:space="preserve">2. Build the network using the Build Network tool</w:t>
+        <w:ind w:left="0" w:firstLine="0"/>
+        <w:rPr/>
+      </w:pPr>
+      <w:r>
+        <w:rPr>
+          <w:rtl w:val="0"/>
+        </w:rPr>
+      </w:r>
+    </w:p>
+    <w:p>
+      <w:pPr>
+        <w:rPr/>
+      </w:pPr>
+      <w:r>
+        <w:rPr>
+          <w:rtl w:val="0"/>
+        </w:rPr>
+        <w:t xml:space="preserve">3. Build the network using the Build Network tool</w:t>
       </w:r>
     </w:p>
     <w:p>
@@ -4169,8 +5164,8 @@
         <w:spacing w:after="240" w:before="240" w:lineRule="auto"/>
         <w:rPr/>
       </w:pPr>
-      <w:bookmarkStart w:colFirst="0" w:colLast="0" w:name="_pif60tig43yd" w:id="10"/>
-      <w:bookmarkEnd w:id="10"/>
+      <w:bookmarkStart w:colFirst="0" w:colLast="0" w:name="_pif60tig43yd" w:id="11"/>
+      <w:bookmarkEnd w:id="11"/>
       <w:r>
         <w:rPr>
           <w:rtl w:val="0"/>
@@ -7932,6 +8927,116 @@
       <w:numFmt w:val="lowerRoman"/>
       <w:lvlText w:val="%9."/>
       <w:lvlJc w:val="right"/>
+      <w:pPr>
+        <w:ind w:left="6480" w:hanging="360"/>
+      </w:pPr>
+      <w:rPr>
+        <w:u w:val="none"/>
+      </w:rPr>
+    </w:lvl>
+  </w:abstractNum>
+  <w:abstractNum w:abstractNumId="14">
+    <w:lvl w:ilvl="0">
+      <w:start w:val="1"/>
+      <w:numFmt w:val="bullet"/>
+      <w:lvlText w:val="●"/>
+      <w:lvlJc w:val="left"/>
+      <w:pPr>
+        <w:ind w:left="720" w:hanging="360"/>
+      </w:pPr>
+      <w:rPr>
+        <w:u w:val="none"/>
+      </w:rPr>
+    </w:lvl>
+    <w:lvl w:ilvl="1">
+      <w:start w:val="1"/>
+      <w:numFmt w:val="bullet"/>
+      <w:lvlText w:val="○"/>
+      <w:lvlJc w:val="left"/>
+      <w:pPr>
+        <w:ind w:left="1440" w:hanging="360"/>
+      </w:pPr>
+      <w:rPr>
+        <w:u w:val="none"/>
+      </w:rPr>
+    </w:lvl>
+    <w:lvl w:ilvl="2">
+      <w:start w:val="1"/>
+      <w:numFmt w:val="bullet"/>
+      <w:lvlText w:val="■"/>
+      <w:lvlJc w:val="left"/>
+      <w:pPr>
+        <w:ind w:left="2160" w:hanging="360"/>
+      </w:pPr>
+      <w:rPr>
+        <w:u w:val="none"/>
+      </w:rPr>
+    </w:lvl>
+    <w:lvl w:ilvl="3">
+      <w:start w:val="1"/>
+      <w:numFmt w:val="bullet"/>
+      <w:lvlText w:val="●"/>
+      <w:lvlJc w:val="left"/>
+      <w:pPr>
+        <w:ind w:left="2880" w:hanging="360"/>
+      </w:pPr>
+      <w:rPr>
+        <w:u w:val="none"/>
+      </w:rPr>
+    </w:lvl>
+    <w:lvl w:ilvl="4">
+      <w:start w:val="1"/>
+      <w:numFmt w:val="bullet"/>
+      <w:lvlText w:val="○"/>
+      <w:lvlJc w:val="left"/>
+      <w:pPr>
+        <w:ind w:left="3600" w:hanging="360"/>
+      </w:pPr>
+      <w:rPr>
+        <w:u w:val="none"/>
+      </w:rPr>
+    </w:lvl>
+    <w:lvl w:ilvl="5">
+      <w:start w:val="1"/>
+      <w:numFmt w:val="bullet"/>
+      <w:lvlText w:val="■"/>
+      <w:lvlJc w:val="left"/>
+      <w:pPr>
+        <w:ind w:left="4320" w:hanging="360"/>
+      </w:pPr>
+      <w:rPr>
+        <w:u w:val="none"/>
+      </w:rPr>
+    </w:lvl>
+    <w:lvl w:ilvl="6">
+      <w:start w:val="1"/>
+      <w:numFmt w:val="bullet"/>
+      <w:lvlText w:val="●"/>
+      <w:lvlJc w:val="left"/>
+      <w:pPr>
+        <w:ind w:left="5040" w:hanging="360"/>
+      </w:pPr>
+      <w:rPr>
+        <w:u w:val="none"/>
+      </w:rPr>
+    </w:lvl>
+    <w:lvl w:ilvl="7">
+      <w:start w:val="1"/>
+      <w:numFmt w:val="bullet"/>
+      <w:lvlText w:val="○"/>
+      <w:lvlJc w:val="left"/>
+      <w:pPr>
+        <w:ind w:left="5760" w:hanging="360"/>
+      </w:pPr>
+      <w:rPr>
+        <w:u w:val="none"/>
+      </w:rPr>
+    </w:lvl>
+    <w:lvl w:ilvl="8">
+      <w:start w:val="1"/>
+      <w:numFmt w:val="bullet"/>
+      <w:lvlText w:val="■"/>
+      <w:lvlJc w:val="left"/>
       <w:pPr>
         <w:ind w:left="6480" w:hanging="360"/>
       </w:pPr>
@@ -7978,6 +9083,9 @@
   </w:num>
   <w:num w:numId="13">
     <w:abstractNumId w:val="13"/>
+  </w:num>
+  <w:num w:numId="14">
+    <w:abstractNumId w:val="14"/>
   </w:num>
 </w:numbering>
 </file>
@@ -8040,6 +9148,7 @@
     </w:pPr>
     <w:rPr>
       <w:b w:val="0"/>
+      <w:bCs w:val="0"/>
       <w:sz w:val="32"/>
       <w:szCs w:val="32"/>
     </w:rPr>
@@ -8056,6 +9165,7 @@
     </w:pPr>
     <w:rPr>
       <w:b w:val="0"/>
+      <w:bCs w:val="0"/>
       <w:color w:val="434343"/>
       <w:sz w:val="28"/>
       <w:szCs w:val="28"/>
@@ -8105,6 +9215,7 @@
     </w:pPr>
     <w:rPr>
       <w:i w:val="1"/>
+      <w:iCs w:val="1"/>
       <w:color w:val="666666"/>
       <w:sz w:val="22"/>
       <w:szCs w:val="22"/>
@@ -8138,6 +9249,7 @@
     <w:rPr>
       <w:rFonts w:ascii="Arial" w:cs="Arial" w:eastAsia="Arial" w:hAnsi="Arial"/>
       <w:i w:val="0"/>
+      <w:iCs w:val="0"/>
       <w:color w:val="666666"/>
       <w:sz w:val="30"/>
       <w:szCs w:val="30"/>

</xml_diff>